<commit_message>
Tareas de DWEC, IA GEN, DESPLIEGUE, Interfaces Web terminados 10/15/2026
</commit_message>
<xml_diff>
--- a/PLANTILLA-DAW-CESAR (2).docx
+++ b/PLANTILLA-DAW-CESAR (2).docx
@@ -42,7 +42,7 @@
         <w:rPr>
           <w:lang w:val="es-US"/>
         </w:rPr>
-        <w:t>Despliegue web en entorno cliente</w:t>
+        <w:t>ASIGNATURA</w:t>
       </w:r>
     </w:p>
     <w:p>
@@ -83,7 +83,7 @@
       </w:r>
       <w:r>
         <w:rPr>
-          <w:b/>
+          <w:bCs/>
           <w:lang w:val="es-US"/>
         </w:rPr>
         <w:t>César Valverde Pardo</w:t>
@@ -154,7 +154,14 @@
           <w:tab w:val="right" w:leader="dot" w:pos="9056"/>
         </w:tabs>
         <w:rPr>
+          <w:rFonts w:asciiTheme="minorHAnsi" w:hAnsiTheme="minorHAnsi"/>
           <w:noProof/>
+          <w:color w:val="auto"/>
+          <w:kern w:val="2"/>
+          <w:sz w:val="24"/>
+          <w:szCs w:val="24"/>
+          <w:lang w:val="es-US" w:eastAsia="es-US"/>
+          <w14:ligatures w14:val="standardContextual"/>
         </w:rPr>
       </w:pPr>
       <w:r>
@@ -166,13 +173,14 @@
       <w:r>
         <w:fldChar w:fldCharType="separate"/>
       </w:r>
-      <w:hyperlink w:anchor="_Toc242812428" w:history="1">
+      <w:hyperlink w:anchor="_Toc242924652" w:history="1">
         <w:r>
           <w:rPr>
             <w:rStyle w:val="Hyperlink"/>
             <w:noProof/>
+            <w:lang w:val="es-US"/>
           </w:rPr>
-          <w:t>1. Introducción</w:t>
+          <w:t>1. Desarrollo de la práctica</w:t>
         </w:r>
         <w:r>
           <w:rPr>
@@ -193,7 +201,7 @@
             <w:noProof/>
             <w:webHidden/>
           </w:rPr>
-          <w:instrText xml:space="preserve"> PAGEREF _Toc242812428 \h </w:instrText>
+          <w:instrText xml:space="preserve"> PAGEREF _Toc242924652 \h </w:instrText>
         </w:r>
         <w:r>
           <w:rPr>
@@ -213,7 +221,7 @@
             <w:noProof/>
             <w:webHidden/>
           </w:rPr>
-          <w:t>1</w:t>
+          <w:t>3</w:t>
         </w:r>
         <w:r>
           <w:rPr>
@@ -226,21 +234,29 @@
     </w:p>
     <w:p>
       <w:pPr>
-        <w:pStyle w:val="TOC1"/>
+        <w:pStyle w:val="TOC2"/>
         <w:tabs>
           <w:tab w:val="right" w:leader="dot" w:pos="9056"/>
         </w:tabs>
         <w:rPr>
+          <w:rFonts w:asciiTheme="minorHAnsi" w:hAnsiTheme="minorHAnsi"/>
           <w:noProof/>
+          <w:color w:val="auto"/>
+          <w:kern w:val="2"/>
+          <w:sz w:val="24"/>
+          <w:szCs w:val="24"/>
+          <w:lang w:val="es-US" w:eastAsia="es-US"/>
+          <w14:ligatures w14:val="standardContextual"/>
         </w:rPr>
       </w:pPr>
-      <w:hyperlink w:anchor="_Toc242812429" w:history="1">
+      <w:hyperlink w:anchor="_Toc242924653" w:history="1">
         <w:r>
           <w:rPr>
             <w:rStyle w:val="Hyperlink"/>
             <w:noProof/>
+            <w:lang w:val="es-US"/>
           </w:rPr>
-          <w:t>2. Objetivos</w:t>
+          <w:t>1.1. Preparación</w:t>
         </w:r>
         <w:r>
           <w:rPr>
@@ -261,7 +277,7 @@
             <w:noProof/>
             <w:webHidden/>
           </w:rPr>
-          <w:instrText xml:space="preserve"> PAGEREF _Toc242812429 \h </w:instrText>
+          <w:instrText xml:space="preserve"> PAGEREF _Toc242924653 \h </w:instrText>
         </w:r>
         <w:r>
           <w:rPr>
@@ -281,7 +297,7 @@
             <w:noProof/>
             <w:webHidden/>
           </w:rPr>
-          <w:t>1</w:t>
+          <w:t>3</w:t>
         </w:r>
         <w:r>
           <w:rPr>
@@ -294,21 +310,29 @@
     </w:p>
     <w:p>
       <w:pPr>
-        <w:pStyle w:val="TOC1"/>
+        <w:pStyle w:val="TOC2"/>
         <w:tabs>
           <w:tab w:val="right" w:leader="dot" w:pos="9056"/>
         </w:tabs>
         <w:rPr>
+          <w:rFonts w:asciiTheme="minorHAnsi" w:hAnsiTheme="minorHAnsi"/>
           <w:noProof/>
+          <w:color w:val="auto"/>
+          <w:kern w:val="2"/>
+          <w:sz w:val="24"/>
+          <w:szCs w:val="24"/>
+          <w:lang w:val="es-US" w:eastAsia="es-US"/>
+          <w14:ligatures w14:val="standardContextual"/>
         </w:rPr>
       </w:pPr>
-      <w:hyperlink w:anchor="_Toc242812430" w:history="1">
+      <w:hyperlink w:anchor="_Toc242924654" w:history="1">
         <w:r>
           <w:rPr>
             <w:rStyle w:val="Hyperlink"/>
             <w:noProof/>
+            <w:lang w:val="es-US"/>
           </w:rPr>
-          <w:t>3. Entorno y herramientas</w:t>
+          <w:t>1.2. Implementación</w:t>
         </w:r>
         <w:r>
           <w:rPr>
@@ -329,7 +353,7 @@
             <w:noProof/>
             <w:webHidden/>
           </w:rPr>
-          <w:instrText xml:space="preserve"> PAGEREF _Toc242812430 \h </w:instrText>
+          <w:instrText xml:space="preserve"> PAGEREF _Toc242924654 \h </w:instrText>
         </w:r>
         <w:r>
           <w:rPr>
@@ -349,7 +373,7 @@
             <w:noProof/>
             <w:webHidden/>
           </w:rPr>
-          <w:t>1</w:t>
+          <w:t>3</w:t>
         </w:r>
         <w:r>
           <w:rPr>
@@ -362,21 +386,29 @@
     </w:p>
     <w:p>
       <w:pPr>
-        <w:pStyle w:val="TOC1"/>
+        <w:pStyle w:val="TOC2"/>
         <w:tabs>
           <w:tab w:val="right" w:leader="dot" w:pos="9056"/>
         </w:tabs>
         <w:rPr>
+          <w:rFonts w:asciiTheme="minorHAnsi" w:hAnsiTheme="minorHAnsi"/>
           <w:noProof/>
+          <w:color w:val="auto"/>
+          <w:kern w:val="2"/>
+          <w:sz w:val="24"/>
+          <w:szCs w:val="24"/>
+          <w:lang w:val="es-US" w:eastAsia="es-US"/>
+          <w14:ligatures w14:val="standardContextual"/>
         </w:rPr>
       </w:pPr>
-      <w:hyperlink w:anchor="_Toc242812431" w:history="1">
+      <w:hyperlink w:anchor="_Toc242924655" w:history="1">
         <w:r>
           <w:rPr>
             <w:rStyle w:val="Hyperlink"/>
             <w:noProof/>
+            <w:lang w:val="es-US"/>
           </w:rPr>
-          <w:t>4. Desarrollo de la práctica</w:t>
+          <w:t>1.1. Preparación</w:t>
         </w:r>
         <w:r>
           <w:rPr>
@@ -397,7 +429,7 @@
             <w:noProof/>
             <w:webHidden/>
           </w:rPr>
-          <w:instrText xml:space="preserve"> PAGEREF _Toc242812431 \h </w:instrText>
+          <w:instrText xml:space="preserve"> PAGEREF _Toc242924655 \h </w:instrText>
         </w:r>
         <w:r>
           <w:rPr>
@@ -417,7 +449,7 @@
             <w:noProof/>
             <w:webHidden/>
           </w:rPr>
-          <w:t>1</w:t>
+          <w:t>3</w:t>
         </w:r>
         <w:r>
           <w:rPr>
@@ -435,16 +467,24 @@
           <w:tab w:val="right" w:leader="dot" w:pos="9056"/>
         </w:tabs>
         <w:rPr>
+          <w:rFonts w:asciiTheme="minorHAnsi" w:hAnsiTheme="minorHAnsi"/>
           <w:noProof/>
+          <w:color w:val="auto"/>
+          <w:kern w:val="2"/>
+          <w:sz w:val="24"/>
+          <w:szCs w:val="24"/>
+          <w:lang w:val="es-US" w:eastAsia="es-US"/>
+          <w14:ligatures w14:val="standardContextual"/>
         </w:rPr>
       </w:pPr>
-      <w:hyperlink w:anchor="_Toc242812432" w:history="1">
+      <w:hyperlink w:anchor="_Toc242924656" w:history="1">
         <w:r>
           <w:rPr>
             <w:rStyle w:val="Hyperlink"/>
             <w:noProof/>
+            <w:lang w:val="es-US"/>
           </w:rPr>
-          <w:t>4.1. Preparación</w:t>
+          <w:t>1.2. Implementación</w:t>
         </w:r>
         <w:r>
           <w:rPr>
@@ -465,7 +505,7 @@
             <w:noProof/>
             <w:webHidden/>
           </w:rPr>
-          <w:instrText xml:space="preserve"> PAGEREF _Toc242812432 \h </w:instrText>
+          <w:instrText xml:space="preserve"> PAGEREF _Toc242924656 \h </w:instrText>
         </w:r>
         <w:r>
           <w:rPr>
@@ -485,7 +525,7 @@
             <w:noProof/>
             <w:webHidden/>
           </w:rPr>
-          <w:t>1</w:t>
+          <w:t>3</w:t>
         </w:r>
         <w:r>
           <w:rPr>
@@ -503,16 +543,24 @@
           <w:tab w:val="right" w:leader="dot" w:pos="9056"/>
         </w:tabs>
         <w:rPr>
+          <w:rFonts w:asciiTheme="minorHAnsi" w:hAnsiTheme="minorHAnsi"/>
           <w:noProof/>
+          <w:color w:val="auto"/>
+          <w:kern w:val="2"/>
+          <w:sz w:val="24"/>
+          <w:szCs w:val="24"/>
+          <w:lang w:val="es-US" w:eastAsia="es-US"/>
+          <w14:ligatures w14:val="standardContextual"/>
         </w:rPr>
       </w:pPr>
-      <w:hyperlink w:anchor="_Toc242812433" w:history="1">
+      <w:hyperlink w:anchor="_Toc242924657" w:history="1">
         <w:r>
           <w:rPr>
             <w:rStyle w:val="Hyperlink"/>
             <w:noProof/>
+            <w:lang w:val="es-US"/>
           </w:rPr>
-          <w:t>4.2. Implementación</w:t>
+          <w:t>1.1. Preparación</w:t>
         </w:r>
         <w:r>
           <w:rPr>
@@ -533,7 +581,7 @@
             <w:noProof/>
             <w:webHidden/>
           </w:rPr>
-          <w:instrText xml:space="preserve"> PAGEREF _Toc242812433 \h </w:instrText>
+          <w:instrText xml:space="preserve"> PAGEREF _Toc242924657 \h </w:instrText>
         </w:r>
         <w:r>
           <w:rPr>
@@ -553,7 +601,7 @@
             <w:noProof/>
             <w:webHidden/>
           </w:rPr>
-          <w:t>1</w:t>
+          <w:t>3</w:t>
         </w:r>
         <w:r>
           <w:rPr>
@@ -566,21 +614,29 @@
     </w:p>
     <w:p>
       <w:pPr>
-        <w:pStyle w:val="TOC1"/>
+        <w:pStyle w:val="TOC2"/>
         <w:tabs>
           <w:tab w:val="right" w:leader="dot" w:pos="9056"/>
         </w:tabs>
         <w:rPr>
+          <w:rFonts w:asciiTheme="minorHAnsi" w:hAnsiTheme="minorHAnsi"/>
           <w:noProof/>
+          <w:color w:val="auto"/>
+          <w:kern w:val="2"/>
+          <w:sz w:val="24"/>
+          <w:szCs w:val="24"/>
+          <w:lang w:val="es-US" w:eastAsia="es-US"/>
+          <w14:ligatures w14:val="standardContextual"/>
         </w:rPr>
       </w:pPr>
-      <w:hyperlink w:anchor="_Toc242812434" w:history="1">
+      <w:hyperlink w:anchor="_Toc242924658" w:history="1">
         <w:r>
           <w:rPr>
             <w:rStyle w:val="Hyperlink"/>
             <w:noProof/>
+            <w:lang w:val="es-US"/>
           </w:rPr>
-          <w:t>5. Comprobaciones y resultados</w:t>
+          <w:t>1.2. Implementación</w:t>
         </w:r>
         <w:r>
           <w:rPr>
@@ -601,7 +657,7 @@
             <w:noProof/>
             <w:webHidden/>
           </w:rPr>
-          <w:instrText xml:space="preserve"> PAGEREF _Toc242812434 \h </w:instrText>
+          <w:instrText xml:space="preserve"> PAGEREF _Toc242924658 \h </w:instrText>
         </w:r>
         <w:r>
           <w:rPr>
@@ -621,143 +677,7 @@
             <w:noProof/>
             <w:webHidden/>
           </w:rPr>
-          <w:t>1</w:t>
-        </w:r>
-        <w:r>
-          <w:rPr>
-            <w:noProof/>
-            <w:webHidden/>
-          </w:rPr>
-          <w:fldChar w:fldCharType="end"/>
-        </w:r>
-      </w:hyperlink>
-    </w:p>
-    <w:p>
-      <w:pPr>
-        <w:pStyle w:val="TOC1"/>
-        <w:tabs>
-          <w:tab w:val="right" w:leader="dot" w:pos="9056"/>
-        </w:tabs>
-        <w:rPr>
-          <w:noProof/>
-        </w:rPr>
-      </w:pPr>
-      <w:hyperlink w:anchor="_Toc242812435" w:history="1">
-        <w:r>
-          <w:rPr>
-            <w:rStyle w:val="Hyperlink"/>
-            <w:noProof/>
-          </w:rPr>
-          <w:t>6. Incidencias y soluciones</w:t>
-        </w:r>
-        <w:r>
-          <w:rPr>
-            <w:noProof/>
-            <w:webHidden/>
-          </w:rPr>
-          <w:tab/>
-        </w:r>
-        <w:r>
-          <w:rPr>
-            <w:noProof/>
-            <w:webHidden/>
-          </w:rPr>
-          <w:fldChar w:fldCharType="begin"/>
-        </w:r>
-        <w:r>
-          <w:rPr>
-            <w:noProof/>
-            <w:webHidden/>
-          </w:rPr>
-          <w:instrText xml:space="preserve"> PAGEREF _Toc242812435 \h </w:instrText>
-        </w:r>
-        <w:r>
-          <w:rPr>
-            <w:noProof/>
-            <w:webHidden/>
-          </w:rPr>
-        </w:r>
-        <w:r>
-          <w:rPr>
-            <w:noProof/>
-            <w:webHidden/>
-          </w:rPr>
-          <w:fldChar w:fldCharType="separate"/>
-        </w:r>
-        <w:r>
-          <w:rPr>
-            <w:noProof/>
-            <w:webHidden/>
-          </w:rPr>
-          <w:t>1</w:t>
-        </w:r>
-        <w:r>
-          <w:rPr>
-            <w:noProof/>
-            <w:webHidden/>
-          </w:rPr>
-          <w:fldChar w:fldCharType="end"/>
-        </w:r>
-      </w:hyperlink>
-    </w:p>
-    <w:p>
-      <w:pPr>
-        <w:pStyle w:val="TOC1"/>
-        <w:tabs>
-          <w:tab w:val="right" w:leader="dot" w:pos="9056"/>
-        </w:tabs>
-        <w:rPr>
-          <w:noProof/>
-        </w:rPr>
-      </w:pPr>
-      <w:hyperlink w:anchor="_Toc242812436" w:history="1">
-        <w:r>
-          <w:rPr>
-            <w:rStyle w:val="Hyperlink"/>
-            <w:noProof/>
-          </w:rPr>
-          <w:t>7. Conclusiones</w:t>
-        </w:r>
-        <w:r>
-          <w:rPr>
-            <w:noProof/>
-            <w:webHidden/>
-          </w:rPr>
-          <w:tab/>
-        </w:r>
-        <w:r>
-          <w:rPr>
-            <w:noProof/>
-            <w:webHidden/>
-          </w:rPr>
-          <w:fldChar w:fldCharType="begin"/>
-        </w:r>
-        <w:r>
-          <w:rPr>
-            <w:noProof/>
-            <w:webHidden/>
-          </w:rPr>
-          <w:instrText xml:space="preserve"> PAGEREF _Toc242812436 \h </w:instrText>
-        </w:r>
-        <w:r>
-          <w:rPr>
-            <w:noProof/>
-            <w:webHidden/>
-          </w:rPr>
-        </w:r>
-        <w:r>
-          <w:rPr>
-            <w:noProof/>
-            <w:webHidden/>
-          </w:rPr>
-          <w:fldChar w:fldCharType="separate"/>
-        </w:r>
-        <w:r>
-          <w:rPr>
-            <w:noProof/>
-            <w:webHidden/>
-          </w:rPr>
-          <w:t>1</w:t>
+          <w:t>3</w:t>
         </w:r>
         <w:r>
           <w:rPr>
@@ -785,7 +705,7 @@
           <w:lang w:val="es-US"/>
         </w:rPr>
       </w:pPr>
-      <w:bookmarkStart w:id="0" w:name="_Toc242812431"/>
+      <w:bookmarkStart w:id="0" w:name="_Toc242924652"/>
       <w:r>
         <w:rPr>
           <w:lang w:val="es-US"/>
@@ -808,7 +728,7 @@
           <w:lang w:val="es-US"/>
         </w:rPr>
       </w:pPr>
-      <w:bookmarkStart w:id="1" w:name="_Toc242812432"/>
+      <w:bookmarkStart w:id="1" w:name="_Toc242924653"/>
       <w:r>
         <w:rPr>
           <w:lang w:val="es-US"/>
@@ -843,7 +763,7 @@
           <w:lang w:val="es-US"/>
         </w:rPr>
       </w:pPr>
-      <w:bookmarkStart w:id="2" w:name="_Toc242812433"/>
+      <w:bookmarkStart w:id="2" w:name="_Toc242924654"/>
       <w:r>
         <w:rPr>
           <w:lang w:val="es-US"/>
@@ -857,6 +777,146 @@
         <w:t>.2. Implementación</w:t>
       </w:r>
       <w:bookmarkEnd w:id="2"/>
+    </w:p>
+    <w:p>
+      <w:pPr>
+        <w:rPr>
+          <w:lang w:val="es-US"/>
+        </w:rPr>
+      </w:pPr>
+      <w:r>
+        <w:rPr>
+          <w:lang w:val="es-US"/>
+        </w:rPr>
+        <w:t>[Resume lo aprendido y posibles mejoras.]</w:t>
+      </w:r>
+    </w:p>
+    <w:p>
+      <w:pPr>
+        <w:pStyle w:val="Heading2"/>
+        <w:rPr>
+          <w:lang w:val="es-US"/>
+        </w:rPr>
+      </w:pPr>
+      <w:bookmarkStart w:id="3" w:name="_Toc242924655"/>
+      <w:r>
+        <w:rPr>
+          <w:lang w:val="es-US"/>
+        </w:rPr>
+        <w:t>1</w:t>
+      </w:r>
+      <w:r>
+        <w:rPr>
+          <w:lang w:val="es-US"/>
+        </w:rPr>
+        <w:t>.1. Preparación</w:t>
+      </w:r>
+      <w:bookmarkEnd w:id="3"/>
+    </w:p>
+    <w:p>
+      <w:pPr>
+        <w:rPr>
+          <w:lang w:val="es-US"/>
+        </w:rPr>
+      </w:pPr>
+      <w:r>
+        <w:rPr>
+          <w:lang w:val="es-US"/>
+        </w:rPr>
+        <w:t>[Resume lo aprendido y posibles mejoras.]</w:t>
+      </w:r>
+    </w:p>
+    <w:p>
+      <w:pPr>
+        <w:pStyle w:val="Heading2"/>
+        <w:rPr>
+          <w:lang w:val="es-US"/>
+        </w:rPr>
+      </w:pPr>
+      <w:bookmarkStart w:id="4" w:name="_Toc242924656"/>
+      <w:r>
+        <w:rPr>
+          <w:lang w:val="es-US"/>
+        </w:rPr>
+        <w:t>1</w:t>
+      </w:r>
+      <w:r>
+        <w:rPr>
+          <w:lang w:val="es-US"/>
+        </w:rPr>
+        <w:t>.2. Implementación</w:t>
+      </w:r>
+      <w:bookmarkEnd w:id="4"/>
+    </w:p>
+    <w:p>
+      <w:pPr>
+        <w:rPr>
+          <w:lang w:val="es-US"/>
+        </w:rPr>
+      </w:pPr>
+      <w:r>
+        <w:rPr>
+          <w:lang w:val="es-US"/>
+        </w:rPr>
+        <w:t>[Resume lo aprendido y posibles mejoras.]</w:t>
+      </w:r>
+    </w:p>
+    <w:p>
+      <w:pPr>
+        <w:pStyle w:val="Heading2"/>
+        <w:rPr>
+          <w:lang w:val="es-US"/>
+        </w:rPr>
+      </w:pPr>
+      <w:bookmarkStart w:id="5" w:name="_Toc242924657"/>
+      <w:r>
+        <w:rPr>
+          <w:lang w:val="es-US"/>
+        </w:rPr>
+        <w:t>1</w:t>
+      </w:r>
+      <w:r>
+        <w:rPr>
+          <w:lang w:val="es-US"/>
+        </w:rPr>
+        <w:t>.1. Preparación</w:t>
+      </w:r>
+      <w:bookmarkEnd w:id="5"/>
+    </w:p>
+    <w:p>
+      <w:pPr>
+        <w:rPr>
+          <w:lang w:val="es-US"/>
+        </w:rPr>
+      </w:pPr>
+      <w:r>
+        <w:rPr>
+          <w:lang w:val="es-US"/>
+        </w:rPr>
+        <w:t>[Resume lo aprendido y posibles mejoras.]</w:t>
+      </w:r>
+    </w:p>
+    <w:p>
+      <w:pPr>
+        <w:pStyle w:val="Heading2"/>
+        <w:rPr>
+          <w:lang w:val="es-US"/>
+        </w:rPr>
+      </w:pPr>
+      <w:bookmarkStart w:id="6" w:name="_Toc242924658"/>
+      <w:r>
+        <w:rPr>
+          <w:lang w:val="es-US"/>
+        </w:rPr>
+        <w:t>1</w:t>
+      </w:r>
+      <w:r>
+        <w:rPr>
+          <w:lang w:val="es-US"/>
+        </w:rPr>
+        <w:t>.2. Implementación</w:t>
+      </w:r>
+      <w:bookmarkEnd w:id="6"/>
     </w:p>
     <w:p>
       <w:pPr>
@@ -1788,6 +1848,7 @@
   <w:style w:type="character" w:default="1" w:styleId="DefaultParagraphFont">
     <w:name w:val="Default Paragraph Font"/>
     <w:uiPriority w:val="1"/>
+    <w:semiHidden/>
     <w:unhideWhenUsed/>
   </w:style>
   <w:style w:type="table" w:default="1" w:styleId="TableNormal">

</xml_diff>